<commit_message>
Report: revise task 3 doc
</commit_message>
<xml_diff>
--- a/Report/Task 03_TowerOfHanoi_Report.docx
+++ b/Report/Task 03_TowerOfHanoi_Report.docx
@@ -19,53 +19,57 @@
     <w:p>
       <w:pPr>
         <w:spacing w:before="240" w:after="120" w:line="360" w:lineRule="auto"/>
+        <w:ind w:firstLine="360"/>
         <w:jc w:val="both"/>
       </w:pPr>
       <w:r>
         <w:rPr>
           <w:color w:val="000000"/>
         </w:rPr>
-        <w:t xml:space="preserve">The Tower of Hanoi is one of the most celebrated problems in computer science and discrete mathematics. Originally conceived by the French mathematician Edouard Lucas in 1883, the classical three-peg variant has a closed-form solution requiring exactly 2ⁿ − 1 moves for n disks. Adding a fourth peg transforms the problem into a rich </w:t>
-      </w:r>
-      <w:proofErr w:type="spellStart"/>
+        <w:t>The Tower of Hanoi is one of the most celebrated problems in computer science and discrete mathematics. Originally conceived by the French mathematician Edouard Lucas in 1883, the classical three-peg variant has a closed-form solution requiring exactly 2ⁿ − 1 moves for n disks. Adding a fourth peg transforms the problem into a rich optimi</w:t>
+      </w:r>
       <w:r>
         <w:rPr>
           <w:color w:val="000000"/>
         </w:rPr>
-        <w:t>optimisation</w:t>
-      </w:r>
-      <w:proofErr w:type="spellEnd"/>
+        <w:t>z</w:t>
+      </w:r>
       <w:r>
         <w:rPr>
           <w:color w:val="000000"/>
         </w:rPr>
-        <w:t xml:space="preserve"> challenge whose exact solution remained conjectural for decades.</w:t>
+        <w:t xml:space="preserve">ation challenge whose exact solution remained </w:t>
+      </w:r>
+      <w:r>
+        <w:rPr>
+          <w:color w:val="000000"/>
+        </w:rPr>
+        <w:t>u</w:t>
+      </w:r>
+      <w:r>
+        <w:rPr>
+          <w:color w:val="000000"/>
+        </w:rPr>
+        <w:t xml:space="preserve">nproven </w:t>
+      </w:r>
+      <w:r>
+        <w:rPr>
+          <w:color w:val="000000"/>
+        </w:rPr>
+        <w:t>for decades.</w:t>
       </w:r>
     </w:p>
     <w:p>
       <w:pPr>
         <w:spacing w:before="240" w:after="120" w:line="360" w:lineRule="auto"/>
+        <w:ind w:firstLine="360"/>
         <w:jc w:val="both"/>
       </w:pPr>
       <w:r>
         <w:rPr>
           <w:color w:val="000000"/>
         </w:rPr>
-        <w:t xml:space="preserve">This report provides an exhaustive treatment of the four-peg Tower of Hanoi. It covers six distinct algorithmic techniques, </w:t>
-      </w:r>
-      <w:proofErr w:type="spellStart"/>
-      <w:r>
-        <w:rPr>
-          <w:color w:val="000000"/>
-        </w:rPr>
-        <w:t>analysing</w:t>
-      </w:r>
-      <w:proofErr w:type="spellEnd"/>
-      <w:r>
-        <w:rPr>
-          <w:color w:val="000000"/>
-        </w:rPr>
-        <w:t xml:space="preserve"> each one from first principles: what the technique is, how it works, its advantages and disadvantages, the cases where it succeeds or fails, how failures can be remedied, time and space complexity, and a detailed cross-technique comparison. The primary algorithm implemented in Java is the Frame-Stewart Dynamic Programming approach, which produces the best known and verified-optimal solution of 33 moves for eight disks.</w:t>
+        <w:t>The primary algorithm implemented in Java is the Frame-Stewart Dynamic Programming approach, which produces the best known and verified-optimal solution of 33 moves for eight disks.</w:t>
       </w:r>
     </w:p>
     <w:p>
@@ -259,6 +263,11 @@
       </w:r>
     </w:p>
     <w:p>
+      <w:r>
+        <w:br w:type="page"/>
+      </w:r>
+    </w:p>
+    <w:p>
       <w:pPr>
         <w:pStyle w:val="Heading1"/>
         <w:numPr>
@@ -291,6 +300,7 @@
     <w:p>
       <w:pPr>
         <w:spacing w:before="240" w:after="120" w:line="360" w:lineRule="auto"/>
+        <w:ind w:firstLine="360"/>
         <w:jc w:val="both"/>
       </w:pPr>
       <w:r>
@@ -318,6 +328,7 @@
     <w:p>
       <w:pPr>
         <w:spacing w:before="240" w:after="120" w:line="360" w:lineRule="auto"/>
+        <w:ind w:firstLine="360"/>
         <w:jc w:val="both"/>
       </w:pPr>
       <w:r>
@@ -326,14 +337,12 @@
         </w:rPr>
         <w:t xml:space="preserve">With four pegs, the Frame-Stewart algorithm introduces an </w:t>
       </w:r>
-      <w:proofErr w:type="spellStart"/>
       <w:r>
         <w:rPr>
           <w:color w:val="000000"/>
         </w:rPr>
-        <w:t>optimised</w:t>
-      </w:r>
-      <w:proofErr w:type="spellEnd"/>
+        <w:t>optimized</w:t>
+      </w:r>
       <w:r>
         <w:rPr>
           <w:color w:val="000000"/>
@@ -394,13 +403,38 @@
     <w:p>
       <w:pPr>
         <w:spacing w:before="240" w:after="120" w:line="360" w:lineRule="auto"/>
+        <w:ind w:firstLine="360"/>
         <w:jc w:val="both"/>
-      </w:pPr>
-      <w:r>
         <w:rPr>
           <w:color w:val="000000"/>
         </w:rPr>
-        <w:t>Yes. The DP table yields optimal split k = 4 for n = 8. The decomposition is: move disks 1–4 from A to B using 4 pegs (9 moves), move disks 5–8 from A to D using 3 pegs with B frozen (15 moves), move disks 1–4 from B to D using 4 pegs (9 moves). Total: 9 + 15 + 9 = 33 moves, matching the DP prediction exactly.</w:t>
+      </w:pPr>
+      <w:r>
+        <w:rPr>
+          <w:b/>
+          <w:bCs/>
+          <w:color w:val="000000"/>
+        </w:rPr>
+        <w:t>Yes</w:t>
+      </w:r>
+      <w:r>
+        <w:rPr>
+          <w:color w:val="000000"/>
+        </w:rPr>
+        <w:t>. The DP table yields optimal split k = 4 for n = 8. The decomposition is: move disks 1–4 from A to B using 4 pegs (9 moves), move disks 5–8 from A to D using 3 pegs with B frozen (15 moves), move disks 1–4 from B to D using 4 pegs (9 moves). Total: 9 + 15 + 9 = 33 moves, matching the DP prediction exactly.</w:t>
+      </w:r>
+    </w:p>
+    <w:p>
+      <w:pPr>
+        <w:rPr>
+          <w:color w:val="000000"/>
+        </w:rPr>
+      </w:pPr>
+      <w:r>
+        <w:rPr>
+          <w:color w:val="000000"/>
+        </w:rPr>
+        <w:br w:type="page"/>
       </w:r>
     </w:p>
     <w:p>
@@ -413,6 +447,7 @@
       </w:pPr>
       <w:bookmarkStart w:id="6" w:name="_Toc228748428"/>
       <w:r>
+        <w:lastRenderedPageBreak/>
         <w:t>Algorithmic Techniques – Comprehensive Analysis</w:t>
       </w:r>
       <w:bookmarkEnd w:id="6"/>
@@ -420,6 +455,7 @@
     <w:p>
       <w:pPr>
         <w:spacing w:before="240" w:after="120" w:line="360" w:lineRule="auto"/>
+        <w:ind w:firstLine="360"/>
         <w:jc w:val="both"/>
         <w:rPr>
           <w:color w:val="000000"/>
@@ -431,24 +467,6 @@
         </w:rPr>
         <w:t>This section analyses every applicable technique across seven dimensions: definition, mechanism, advantages, disadvantages, success/failure cases, enhancement opportunities, and complexity.</w:t>
       </w:r>
-    </w:p>
-    <w:p>
-      <w:pPr>
-        <w:spacing w:before="240" w:after="120" w:line="360" w:lineRule="auto"/>
-        <w:jc w:val="both"/>
-        <w:rPr>
-          <w:color w:val="000000"/>
-        </w:rPr>
-      </w:pPr>
-    </w:p>
-    <w:p>
-      <w:pPr>
-        <w:spacing w:before="240" w:after="120" w:line="360" w:lineRule="auto"/>
-        <w:jc w:val="both"/>
-        <w:rPr>
-          <w:color w:val="000000"/>
-        </w:rPr>
-      </w:pPr>
     </w:p>
     <w:p>
       <w:pPr>
@@ -461,7 +479,6 @@
       </w:pPr>
       <w:bookmarkStart w:id="7" w:name="_Toc228748429"/>
       <w:r>
-        <w:lastRenderedPageBreak/>
         <w:t>Technique 1: Dynamic Programming (Frame-Stewart)</w:t>
       </w:r>
       <w:bookmarkEnd w:id="7"/>
@@ -484,27 +501,60 @@
     <w:p>
       <w:pPr>
         <w:spacing w:before="240" w:after="120" w:line="360" w:lineRule="auto"/>
+        <w:ind w:firstLine="720"/>
         <w:jc w:val="both"/>
-      </w:pPr>
-      <w:r>
         <w:rPr>
           <w:color w:val="000000"/>
         </w:rPr>
-        <w:t xml:space="preserve">Dynamic Programming (DP) is an algorithm design paradigm that solves complex </w:t>
-      </w:r>
-      <w:proofErr w:type="spellStart"/>
+      </w:pPr>
       <w:r>
         <w:rPr>
           <w:color w:val="000000"/>
         </w:rPr>
-        <w:t>optimisation</w:t>
-      </w:r>
-      <w:proofErr w:type="spellEnd"/>
+        <w:t>Dynamic Programming (DP) is an algorithm design paradigm that solves complex optimi</w:t>
+      </w:r>
       <w:r>
         <w:rPr>
           <w:color w:val="000000"/>
         </w:rPr>
-        <w:t xml:space="preserve"> problems by decomposing them into overlapping sub-problems, solving each sub-problem exactly once, and storing results in a table to avoid redundant computation. It is applicable when the problem exhibits optimal substructure (the global optimum contains local optima) and overlapping sub-problems (identical sub-problems recur throughout the computation). For four-peg Tower of Hanoi, DP is applied through the Frame-Stewart algorithm (Frame &amp; Stewart, 1941): a bottom-up tabulation that finds the optimal disk-split k for every disk count from 1 to n.</w:t>
+        <w:t>z</w:t>
+      </w:r>
+      <w:r>
+        <w:rPr>
+          <w:color w:val="000000"/>
+        </w:rPr>
+        <w:t xml:space="preserve">ation problems by decomposing them into overlapping sub-problems, solving each sub-problem exactly once, and storing results in a table to avoid redundant computation. It is applicable when the problem exhibits </w:t>
+      </w:r>
+      <w:r>
+        <w:rPr>
+          <w:color w:val="000000"/>
+        </w:rPr>
+        <w:t>the principle of optimality</w:t>
+      </w:r>
+      <w:r>
+        <w:rPr>
+          <w:color w:val="000000"/>
+        </w:rPr>
+        <w:t xml:space="preserve"> and overlapping sub-problems</w:t>
+      </w:r>
+      <w:r>
+        <w:rPr>
+          <w:color w:val="000000"/>
+        </w:rPr>
+        <w:t xml:space="preserve">. </w:t>
+      </w:r>
+    </w:p>
+    <w:p>
+      <w:pPr>
+        <w:spacing w:before="240" w:after="120" w:line="360" w:lineRule="auto"/>
+        <w:ind w:firstLine="720"/>
+        <w:jc w:val="both"/>
+      </w:pPr>
+      <w:r>
+        <w:rPr>
+          <w:color w:val="000000"/>
+        </w:rPr>
+        <w:t>For four-peg Tower of Hanoi, DP is applied through the Frame-Stewart algorithm (Frame &amp; Stewart, 1941): a bottom-up tabulation that finds the optimal disk-split k for every disk count from 1 to n.</w:t>
       </w:r>
     </w:p>
     <w:p>
@@ -525,12 +575,16 @@
     <w:p>
       <w:pPr>
         <w:spacing w:before="240" w:after="120" w:line="360" w:lineRule="auto"/>
+        <w:ind w:firstLine="360"/>
         <w:jc w:val="both"/>
-      </w:pPr>
-      <w:r>
         <w:rPr>
           <w:color w:val="000000"/>
         </w:rPr>
+      </w:pPr>
+      <w:r>
+        <w:rPr>
+          <w:color w:val="000000"/>
+        </w:rPr>
         <w:t>The algorithm has two distinct phases. First, the DP pre-computation phase fills the table dp4[</w:t>
       </w:r>
       <w:proofErr w:type="gramStart"/>
@@ -559,7 +613,20 @@
         <w:rPr>
           <w:color w:val="000000"/>
         </w:rPr>
-        <w:t xml:space="preserve">, every split point k from 1 to n-1 is evaluated. The candidate cost is 2*dp4[k] + (2^(n-k) - 1), which represents: two four-peg sub-problems of size k plus one three-peg sub-problem of size n-k. The minimum candidate is stored alongside the optimal k. Second, the move generation phase uses the pre-computed split table to drive recursion: hanoi4 calls hanoi4 for the top-k sub-problem, hanoi3 for the locked middle sub-problem, and hanoi4 again for the </w:t>
+        <w:t xml:space="preserve">, every split point k from 1 to n-1 is evaluated. The candidate cost is 2*dp4[k] + (2^(n-k) - 1), which represents: two four-peg sub-problems of size k plus one three-peg sub-problem of size n-k. </w:t>
+      </w:r>
+    </w:p>
+    <w:p>
+      <w:pPr>
+        <w:spacing w:before="240" w:after="120" w:line="360" w:lineRule="auto"/>
+        <w:ind w:firstLine="360"/>
+        <w:jc w:val="both"/>
+      </w:pPr>
+      <w:r>
+        <w:rPr>
+          <w:color w:val="000000"/>
+        </w:rPr>
+        <w:t xml:space="preserve">The minimum candidate is stored alongside the optimal k. Second, the move generation phase uses the pre-computed split table to drive recursion: hanoi4 calls hanoi4 for the top-k sub-problem, hanoi3 for the locked middle sub-problem, and hanoi4 again for the </w:t>
       </w:r>
       <w:r>
         <w:rPr>
@@ -860,6 +927,7 @@
           <w:sz w:val="18"/>
           <w:szCs w:val="18"/>
         </w:rPr>
+        <w:lastRenderedPageBreak/>
         <w:t xml:space="preserve">        dp4[n</w:t>
       </w:r>
       <w:proofErr w:type="gramStart"/>
@@ -1237,9 +1305,9 @@
         <w:t>/ finalize top-k to destination</w:t>
       </w:r>
     </w:p>
-    <w:p/>
-    <w:p/>
-    <w:p/>
+    <w:p>
+      <w:bookmarkStart w:id="10" w:name="_Toc228748432"/>
+    </w:p>
     <w:p>
       <w:pPr>
         <w:pStyle w:val="Heading3"/>
@@ -1249,9 +1317,7 @@
         </w:numPr>
         <w:spacing w:line="360" w:lineRule="auto"/>
       </w:pPr>
-      <w:bookmarkStart w:id="10" w:name="_Toc228748432"/>
-      <w:r>
-        <w:lastRenderedPageBreak/>
+      <w:r>
         <w:t>Advantages</w:t>
       </w:r>
       <w:bookmarkEnd w:id="10"/>
@@ -1748,6 +1814,7 @@
           <w:bCs/>
           <w:color w:val="1F3864"/>
         </w:rPr>
+        <w:lastRenderedPageBreak/>
         <w:t xml:space="preserve">Failure Cases: </w:t>
       </w:r>
       <w:r>
@@ -1770,7 +1837,6 @@
         <w:spacing w:line="360" w:lineRule="auto"/>
       </w:pPr>
       <w:r>
-        <w:lastRenderedPageBreak/>
         <w:t>Can Failure be Enhanced or Avoided?</w:t>
       </w:r>
       <w:bookmarkEnd w:id="13"/>
@@ -2011,6 +2077,11 @@
       </w:r>
     </w:p>
     <w:p>
+      <w:r>
+        <w:br w:type="page"/>
+      </w:r>
+    </w:p>
+    <w:p>
       <w:pPr>
         <w:pStyle w:val="Heading2"/>
         <w:numPr>
@@ -2021,6 +2092,7 @@
       </w:pPr>
       <w:bookmarkStart w:id="15" w:name="_Toc228748437"/>
       <w:r>
+        <w:lastRenderedPageBreak/>
         <w:t xml:space="preserve">Technique </w:t>
       </w:r>
       <w:r>
@@ -2049,6 +2121,7 @@
     <w:p>
       <w:pPr>
         <w:spacing w:before="240" w:after="120" w:line="360" w:lineRule="auto"/>
+        <w:ind w:firstLine="720"/>
         <w:jc w:val="both"/>
       </w:pPr>
       <w:r>
@@ -2076,6 +2149,7 @@
     <w:p>
       <w:pPr>
         <w:spacing w:before="240" w:after="120" w:line="360" w:lineRule="auto"/>
+        <w:ind w:firstLine="360"/>
         <w:jc w:val="both"/>
       </w:pPr>
       <w:r>
@@ -2110,14 +2184,7 @@
         <w:rPr>
           <w:color w:val="000000"/>
         </w:rPr>
-        <w:t xml:space="preserve">. The BFS explores every state reachable from the initial configuration, layer by layer, </w:t>
-      </w:r>
-      <w:r>
-        <w:rPr>
-          <w:color w:val="000000"/>
-        </w:rPr>
-        <w:lastRenderedPageBreak/>
-        <w:t>maintaining a visited set to avoid cycles. When the goal configuration (all disks on peg D) is reached, the predecessor map is used to reconstruct the move sequence.</w:t>
+        <w:t>. The BFS explores every state reachable from the initial configuration, layer by layer, maintaining a visited set to avoid cycles. When the goal configuration (all disks on peg D) is reached, the predecessor map is used to reconstruct the move sequence.</w:t>
       </w:r>
     </w:p>
     <w:p>
@@ -2633,6 +2700,7 @@
         <w:rPr>
           <w:color w:val="000000"/>
         </w:rPr>
+        <w:lastRenderedPageBreak/>
         <w:t>Catastrophic memory: the state space has size 4ⁿ. For n=8: 65,536 states; for n=20: over 10¹² states.</w:t>
       </w:r>
     </w:p>
@@ -2777,7 +2845,6 @@
       </w:pPr>
       <w:bookmarkStart w:id="21" w:name="_Toc228748443"/>
       <w:r>
-        <w:lastRenderedPageBreak/>
         <w:t>Can Failure be Enhanced or Avoided?</w:t>
       </w:r>
       <w:bookmarkEnd w:id="21"/>
@@ -2941,7 +3008,13 @@
         <w:rPr>
           <w:color w:val="000000"/>
         </w:rPr>
+        <w:lastRenderedPageBreak/>
         <w:t>Can complexity be enhanced? Bidirectional BFS improves to O(4^(n/2) · n) in time and space, reducing the exponent by half. IDA* reduces space to O(n) but does not improve worst-case time. No approach eliminates the exponential growth; Frame-Stewart DP is the correct algorithm for large n.</w:t>
+      </w:r>
+    </w:p>
+    <w:p>
+      <w:r>
+        <w:br w:type="page"/>
       </w:r>
     </w:p>
     <w:p>
@@ -2955,6 +3028,7 @@
       </w:pPr>
       <w:bookmarkStart w:id="23" w:name="_Toc228748445"/>
       <w:r>
+        <w:lastRenderedPageBreak/>
         <w:t xml:space="preserve">Technique </w:t>
       </w:r>
       <w:r>
@@ -2983,6 +3057,7 @@
     <w:p>
       <w:pPr>
         <w:spacing w:before="240" w:after="120" w:line="360" w:lineRule="auto"/>
+        <w:ind w:firstLine="720"/>
         <w:jc w:val="both"/>
         <w:rPr>
           <w:color w:val="000000"/>
@@ -2992,28 +3067,32 @@
         <w:rPr>
           <w:color w:val="000000"/>
         </w:rPr>
-        <w:t xml:space="preserve">A* is an informed graph search algorithm that uses a heuristic function h(s) to estimate the remaining cost from any </w:t>
-      </w:r>
-      <w:proofErr w:type="spellStart"/>
+        <w:t>A* is an informed graph search algorithm that uses a heuristic function h(s) to estimate the remaining cost from any state</w:t>
+      </w:r>
       <w:r>
         <w:rPr>
           <w:color w:val="000000"/>
         </w:rPr>
-        <w:t>state s</w:t>
-      </w:r>
-      <w:proofErr w:type="spellEnd"/>
+        <w:t xml:space="preserve"> ‘</w:t>
+      </w:r>
       <w:r>
         <w:rPr>
           <w:color w:val="000000"/>
         </w:rPr>
+        <w:t>s</w:t>
+      </w:r>
+      <w:r>
+        <w:rPr>
+          <w:color w:val="000000"/>
+        </w:rPr>
+        <w:t>’</w:t>
+      </w:r>
+      <w:r>
+        <w:rPr>
+          <w:color w:val="000000"/>
+        </w:rPr>
         <w:t xml:space="preserve"> to the goal. It maintains a priority queue ordered by f(s) = g(s) + h(s), where g(s) is the actual cost from the start state to s, and h(s) is the heuristic estimate of the cost from s to the goal. When h(s) is admissible (never overestimates the true remaining cost), A* is guaranteed to find the optimal solution while exploring fewer states than uninformed BFS.</w:t>
       </w:r>
-    </w:p>
-    <w:p>
-      <w:pPr>
-        <w:spacing w:before="240" w:after="120" w:line="360" w:lineRule="auto"/>
-        <w:jc w:val="both"/>
-      </w:pPr>
     </w:p>
     <w:p>
       <w:pPr>
@@ -3026,7 +3105,6 @@
       </w:pPr>
       <w:bookmarkStart w:id="25" w:name="_Toc228748447"/>
       <w:r>
-        <w:lastRenderedPageBreak/>
         <w:t>How it Works</w:t>
       </w:r>
       <w:bookmarkEnd w:id="25"/>
@@ -3034,6 +3112,7 @@
     <w:p>
       <w:pPr>
         <w:spacing w:before="240" w:after="120" w:line="360" w:lineRule="auto"/>
+        <w:ind w:firstLine="360"/>
         <w:jc w:val="both"/>
       </w:pPr>
       <w:r>
@@ -3663,6 +3742,7 @@
         <w:rPr>
           <w:color w:val="000000"/>
         </w:rPr>
+        <w:lastRenderedPageBreak/>
         <w:t>Still requires exponential memory for storing the open list in the worst case.</w:t>
       </w:r>
     </w:p>
@@ -3733,30 +3813,11 @@
     </w:p>
     <w:p>
       <w:pPr>
-        <w:spacing w:before="60" w:after="60" w:line="360" w:lineRule="auto"/>
-        <w:jc w:val="both"/>
-      </w:pPr>
-    </w:p>
-    <w:p>
-      <w:pPr>
-        <w:spacing w:before="60" w:after="60" w:line="360" w:lineRule="auto"/>
-        <w:jc w:val="both"/>
-      </w:pPr>
-    </w:p>
-    <w:p>
-      <w:pPr>
-        <w:spacing w:before="60" w:after="60" w:line="360" w:lineRule="auto"/>
-        <w:jc w:val="both"/>
-      </w:pPr>
-    </w:p>
-    <w:p>
-      <w:pPr>
         <w:pStyle w:val="Heading3"/>
         <w:spacing w:line="360" w:lineRule="auto"/>
       </w:pPr>
       <w:bookmarkStart w:id="28" w:name="_Toc228748450"/>
       <w:r>
-        <w:lastRenderedPageBreak/>
         <w:t>4.3.5 Success and Failure Analysis</w:t>
       </w:r>
       <w:bookmarkEnd w:id="28"/>
@@ -3874,6 +3935,11 @@
       </w:r>
     </w:p>
     <w:p>
+      <w:r>
+        <w:br w:type="page"/>
+      </w:r>
+    </w:p>
+    <w:p>
       <w:pPr>
         <w:pStyle w:val="Heading2"/>
         <w:numPr>
@@ -3883,6 +3949,7 @@
         <w:spacing w:line="360" w:lineRule="auto"/>
       </w:pPr>
       <w:r>
+        <w:lastRenderedPageBreak/>
         <w:t>Technique 4: Classical Divide and Conquer (Three-Peg Recursion)</w:t>
       </w:r>
     </w:p>
@@ -3903,6 +3970,7 @@
     <w:p>
       <w:pPr>
         <w:spacing w:before="240" w:after="120" w:line="360" w:lineRule="auto"/>
+        <w:ind w:firstLine="720"/>
         <w:jc w:val="both"/>
         <w:rPr>
           <w:color w:val="000000"/>
@@ -3912,26 +3980,24 @@
         <w:rPr>
           <w:color w:val="000000"/>
         </w:rPr>
-        <w:t>Divide and Conquer (D&amp;C) is an algorithm design paradigm that recursively decomposes a problem into two or more sub-problems of the same type, solves each sub-problem independently, and combines the results. The classical Tower of Hanoi solution is the canonical D&amp;C example: an n-disk problem is divided into two (n-1)-disk sub-problems plus one base-case move. The sub-problems are structurally identical to the original problem but smaller.</w:t>
+        <w:t xml:space="preserve">Divide and Conquer (D&amp;C) is an algorithm design paradigm that recursively decomposes a problem into two or more sub-problems of the same type, solves each sub-problem independently, and combines the results. </w:t>
       </w:r>
     </w:p>
     <w:p>
       <w:pPr>
         <w:spacing w:before="240" w:after="120" w:line="360" w:lineRule="auto"/>
+        <w:ind w:firstLine="720"/>
         <w:jc w:val="both"/>
         <w:rPr>
           <w:color w:val="000000"/>
         </w:rPr>
       </w:pPr>
-    </w:p>
-    <w:p>
-      <w:pPr>
-        <w:spacing w:before="240" w:after="120" w:line="360" w:lineRule="auto"/>
-        <w:jc w:val="both"/>
+      <w:r>
         <w:rPr>
           <w:color w:val="000000"/>
         </w:rPr>
-      </w:pPr>
+        <w:t>The classical Tower of Hanoi solution is the canonical D&amp;C example: an n-disk problem is divided into two (n-1)-disk sub-problems plus one base-case move. The sub-problems are structurally identical to the original problem but smaller.</w:t>
+      </w:r>
     </w:p>
     <w:p>
       <w:pPr>
@@ -3944,7 +4010,6 @@
         <w:ind w:left="0" w:firstLine="0"/>
       </w:pPr>
       <w:r>
-        <w:lastRenderedPageBreak/>
         <w:t>How it Works</w:t>
       </w:r>
     </w:p>
@@ -4436,6 +4501,7 @@
         <w:rPr>
           <w:color w:val="000000"/>
         </w:rPr>
+        <w:lastRenderedPageBreak/>
         <w:t>For n=12: 4,095 moves vs. 81 moves (4,959% overhead).</w:t>
       </w:r>
     </w:p>
@@ -4531,7 +4597,6 @@
         <w:ind w:left="0" w:firstLine="0"/>
       </w:pPr>
       <w:r>
-        <w:lastRenderedPageBreak/>
         <w:t>Can Failure be Enhanced or Avoided?</w:t>
       </w:r>
     </w:p>
@@ -4666,6 +4731,11 @@
       </w:r>
     </w:p>
     <w:p>
+      <w:r>
+        <w:br w:type="page"/>
+      </w:r>
+    </w:p>
+    <w:p>
       <w:pPr>
         <w:pStyle w:val="Heading2"/>
         <w:numPr>
@@ -4676,6 +4746,7 @@
       </w:pPr>
       <w:bookmarkStart w:id="30" w:name="_Toc228748469"/>
       <w:r>
+        <w:lastRenderedPageBreak/>
         <w:t xml:space="preserve">Technique </w:t>
       </w:r>
       <w:r>
@@ -4704,6 +4775,7 @@
     <w:p>
       <w:pPr>
         <w:spacing w:before="240" w:after="120" w:line="360" w:lineRule="auto"/>
+        <w:ind w:firstLine="720"/>
         <w:jc w:val="both"/>
         <w:rPr>
           <w:color w:val="000000"/>
@@ -4729,30 +4801,6 @@
         </w:rPr>
         <w:t>) for A*.</w:t>
       </w:r>
-    </w:p>
-    <w:p>
-      <w:pPr>
-        <w:spacing w:before="240" w:after="120" w:line="360" w:lineRule="auto"/>
-        <w:jc w:val="both"/>
-        <w:rPr>
-          <w:color w:val="000000"/>
-        </w:rPr>
-      </w:pPr>
-    </w:p>
-    <w:p>
-      <w:pPr>
-        <w:spacing w:before="240" w:after="120" w:line="360" w:lineRule="auto"/>
-        <w:jc w:val="both"/>
-        <w:rPr>
-          <w:color w:val="000000"/>
-        </w:rPr>
-      </w:pPr>
-    </w:p>
-    <w:p>
-      <w:pPr>
-        <w:spacing w:before="240" w:after="120" w:line="360" w:lineRule="auto"/>
-        <w:jc w:val="both"/>
-      </w:pPr>
     </w:p>
     <w:p>
       <w:pPr>
@@ -4765,7 +4813,6 @@
       </w:pPr>
       <w:bookmarkStart w:id="32" w:name="_Toc228748471"/>
       <w:r>
-        <w:lastRenderedPageBreak/>
         <w:t>How it Works</w:t>
       </w:r>
       <w:bookmarkEnd w:id="32"/>
@@ -5434,6 +5481,7 @@
         <w:rPr>
           <w:color w:val="000000"/>
         </w:rPr>
+        <w:lastRenderedPageBreak/>
         <w:t>Sensitive to heuristic quality: a weak heuristic means many iterations with slight threshold increases.</w:t>
       </w:r>
     </w:p>
@@ -5527,7 +5575,6 @@
           <w:bCs/>
           <w:color w:val="1F3864"/>
         </w:rPr>
-        <w:lastRenderedPageBreak/>
         <w:t xml:space="preserve">Failure Cases: </w:t>
       </w:r>
       <w:r>
@@ -5736,7 +5783,19 @@
         <w:rPr>
           <w:color w:val="000000"/>
         </w:rPr>
-        <w:t>Space: O(n) — linear, the key advantage over A*.</w:t>
+        <w:t>Space: O(n)</w:t>
+      </w:r>
+      <w:r>
+        <w:rPr>
+          <w:color w:val="000000"/>
+        </w:rPr>
+        <w:t>:</w:t>
+      </w:r>
+      <w:r>
+        <w:rPr>
+          <w:color w:val="000000"/>
+        </w:rPr>
+        <w:t xml:space="preserve"> linear, the key advantage over A*.</w:t>
       </w:r>
     </w:p>
     <w:p>
@@ -5753,7 +5812,8 @@
         <w:rPr>
           <w:color w:val="000000"/>
         </w:rPr>
-        <w:t>Can complexity be enhanced? Pattern databases can improve practical time dramatically. Space cannot be reduced below O(n) for any correct optimal algorithm that traces the solution path. Frame-Stewart DP achieves O(n²) pre-computation with O(n) space, making it the gold standard.</w:t>
+        <w:lastRenderedPageBreak/>
+        <w:t>Pattern databases can improve practical time dramatically. Space cannot be reduced below O(n) for any correct optimal algorithm that traces the solution path. Frame-Stewart DP achieves O(n²) pre-computation with O(n) space, making it the gold standard.</w:t>
       </w:r>
     </w:p>
     <w:p>
@@ -5769,10 +5829,9 @@
       </w:pPr>
     </w:p>
     <w:p>
-      <w:pPr>
-        <w:spacing w:before="60" w:after="60" w:line="360" w:lineRule="auto"/>
-        <w:jc w:val="both"/>
-      </w:pPr>
+      <w:r>
+        <w:br w:type="page"/>
+      </w:r>
     </w:p>
     <w:p>
       <w:pPr>
@@ -6999,6 +7058,11 @@
     </w:p>
     <w:p/>
     <w:p>
+      <w:r>
+        <w:br w:type="page"/>
+      </w:r>
+    </w:p>
+    <w:p>
       <w:pPr>
         <w:pStyle w:val="Heading2"/>
         <w:numPr>
@@ -7009,6 +7073,7 @@
       </w:pPr>
       <w:bookmarkStart w:id="43" w:name="_Toc228748482"/>
       <w:r>
+        <w:lastRenderedPageBreak/>
         <w:t>Java Implementation (Key Excerpts)</w:t>
       </w:r>
       <w:bookmarkEnd w:id="43"/>
@@ -7421,7 +7486,6 @@
           <w:sz w:val="18"/>
           <w:szCs w:val="18"/>
         </w:rPr>
-        <w:lastRenderedPageBreak/>
         <w:t xml:space="preserve">    }</w:t>
       </w:r>
     </w:p>
@@ -7440,13 +7504,6 @@
         </w:rPr>
         <w:t>}</w:t>
       </w:r>
-    </w:p>
-    <w:p>
-      <w:pPr>
-        <w:shd w:val="clear" w:color="auto" w:fill="F4F4F4"/>
-        <w:spacing w:line="220" w:lineRule="auto"/>
-        <w:ind w:left="360"/>
-      </w:pPr>
     </w:p>
     <w:p>
       <w:pPr>
@@ -8712,16 +8769,6 @@
     </w:p>
     <w:p>
       <w:pPr>
-        <w:rPr>
-          <w:color w:val="000000"/>
-        </w:rPr>
-      </w:pPr>
-      <w:r>
-        <w:br w:type="page"/>
-      </w:r>
-    </w:p>
-    <w:p>
-      <w:pPr>
         <w:pStyle w:val="Heading1"/>
         <w:numPr>
           <w:ilvl w:val="0"/>
@@ -8753,6 +8800,7 @@
     <w:p>
       <w:pPr>
         <w:spacing w:before="240" w:after="120" w:line="360" w:lineRule="auto"/>
+        <w:ind w:firstLine="360"/>
         <w:jc w:val="both"/>
       </w:pPr>
       <w:r>
@@ -11371,6 +11419,7 @@
     <w:p>
       <w:pPr>
         <w:spacing w:before="240" w:after="120" w:line="360" w:lineRule="auto"/>
+        <w:ind w:firstLine="360"/>
         <w:jc w:val="both"/>
       </w:pPr>
       <w:r>
@@ -14819,6 +14868,19 @@
         </w:tc>
       </w:tr>
     </w:tbl>
+    <w:p/>
+    <w:p>
+      <w:pPr>
+        <w:rPr>
+          <w:b/>
+          <w:bCs/>
+          <w:color w:val="2E75B6"/>
+        </w:rPr>
+      </w:pPr>
+      <w:r>
+        <w:br w:type="page"/>
+      </w:r>
+    </w:p>
     <w:p>
       <w:pPr>
         <w:pStyle w:val="Heading2"/>
@@ -14829,11 +14891,13 @@
         <w:spacing w:line="360" w:lineRule="auto"/>
       </w:pPr>
       <w:r>
+        <w:lastRenderedPageBreak/>
         <w:t>Representative Console Output</w:t>
       </w:r>
     </w:p>
     <w:p>
       <w:pPr>
+        <w:keepNext/>
         <w:jc w:val="center"/>
       </w:pPr>
       <w:bookmarkStart w:id="48" w:name="_Toc228748489"/>
@@ -14857,7 +14921,7 @@
                     <pic:cNvPicPr/>
                   </pic:nvPicPr>
                   <pic:blipFill>
-                    <a:blip r:embed="rId7"/>
+                    <a:blip r:embed="rId8"/>
                     <a:stretch>
                       <a:fillRect/>
                     </a:stretch>
@@ -14890,13 +14954,43 @@
     </w:p>
     <w:p>
       <w:pPr>
+        <w:pStyle w:val="Caption"/>
         <w:jc w:val="center"/>
       </w:pPr>
       <w:r>
+        <w:t xml:space="preserve">Figure </w:t>
+      </w:r>
+      <w:r>
+        <w:fldChar w:fldCharType="begin"/>
+      </w:r>
+      <w:r>
+        <w:instrText xml:space="preserve"> SEQ Figure \* ARABIC </w:instrText>
+      </w:r>
+      <w:r>
+        <w:fldChar w:fldCharType="separate"/>
+      </w:r>
+      <w:r>
         <w:rPr>
           <w:noProof/>
         </w:rPr>
-        <w:lastRenderedPageBreak/>
+        <w:t>1</w:t>
+      </w:r>
+      <w:r>
+        <w:fldChar w:fldCharType="end"/>
+      </w:r>
+      <w:r>
+        <w:t xml:space="preserve"> - Pegs of Hanoi with 3 Disks and 4 Pegs</w:t>
+      </w:r>
+    </w:p>
+    <w:p>
+      <w:pPr>
+        <w:keepNext/>
+        <w:jc w:val="center"/>
+      </w:pPr>
+      <w:r>
+        <w:rPr>
+          <w:noProof/>
+        </w:rPr>
         <w:drawing>
           <wp:inline distT="0" distB="0" distL="0" distR="0" wp14:anchorId="7E551079" wp14:editId="20FFDDC0">
             <wp:extent cx="3950733" cy="2493818"/>
@@ -14913,7 +15007,7 @@
                     <pic:cNvPicPr/>
                   </pic:nvPicPr>
                   <pic:blipFill>
-                    <a:blip r:embed="rId8"/>
+                    <a:blip r:embed="rId9"/>
                     <a:stretch>
                       <a:fillRect/>
                     </a:stretch>
@@ -14946,6 +15040,50 @@
     </w:p>
     <w:p>
       <w:pPr>
+        <w:pStyle w:val="Caption"/>
+        <w:jc w:val="center"/>
+      </w:pPr>
+      <w:r>
+        <w:t xml:space="preserve">Figure </w:t>
+      </w:r>
+      <w:r>
+        <w:fldChar w:fldCharType="begin"/>
+      </w:r>
+      <w:r>
+        <w:instrText xml:space="preserve"> SEQ Figure \* ARABIC </w:instrText>
+      </w:r>
+      <w:r>
+        <w:fldChar w:fldCharType="separate"/>
+      </w:r>
+      <w:r>
+        <w:rPr>
+          <w:noProof/>
+        </w:rPr>
+        <w:t>2</w:t>
+      </w:r>
+      <w:r>
+        <w:fldChar w:fldCharType="end"/>
+      </w:r>
+      <w:r>
+        <w:t xml:space="preserve"> </w:t>
+      </w:r>
+      <w:r>
+        <w:t xml:space="preserve">- Pegs of Hanoi with </w:t>
+      </w:r>
+      <w:r>
+        <w:t>8</w:t>
+      </w:r>
+      <w:r>
+        <w:t xml:space="preserve"> Disks and 4 Pegs</w:t>
+      </w:r>
+    </w:p>
+    <w:p>
+      <w:r>
+        <w:br w:type="page"/>
+      </w:r>
+    </w:p>
+    <w:p>
+      <w:pPr>
         <w:pStyle w:val="Heading1"/>
         <w:numPr>
           <w:ilvl w:val="0"/>
@@ -14953,6 +15091,7 @@
         </w:numPr>
       </w:pPr>
       <w:r>
+        <w:lastRenderedPageBreak/>
         <w:t>Complexity Analysis</w:t>
       </w:r>
       <w:bookmarkEnd w:id="48"/>
@@ -14975,6 +15114,7 @@
     <w:p>
       <w:pPr>
         <w:spacing w:before="240" w:after="120" w:line="360" w:lineRule="auto"/>
+        <w:ind w:firstLine="360"/>
         <w:jc w:val="both"/>
       </w:pPr>
       <w:r>
@@ -15001,6 +15141,7 @@
     <w:p>
       <w:pPr>
         <w:spacing w:before="240" w:after="120" w:line="360" w:lineRule="auto"/>
+        <w:ind w:firstLine="360"/>
         <w:jc w:val="both"/>
       </w:pPr>
       <w:r>
@@ -15633,7 +15774,6 @@
                 <w:sz w:val="20"/>
                 <w:szCs w:val="20"/>
               </w:rPr>
-              <w:lastRenderedPageBreak/>
               <w:t>Total (FS-DP)</w:t>
             </w:r>
           </w:p>
@@ -16321,6 +16461,21 @@
           <w:szCs w:val="20"/>
         </w:rPr>
         <w:t>: Complexity comparison across all techniques. Frame-Stewart DP (first two rows) achieves the best combination of pre-computation efficiency and minimum move count.</w:t>
+      </w:r>
+    </w:p>
+    <w:p>
+      <w:pPr>
+        <w:rPr>
+          <w:b/>
+          <w:bCs/>
+          <w:color w:val="1F3864"/>
+          <w:sz w:val="28"/>
+          <w:szCs w:val="28"/>
+        </w:rPr>
+      </w:pPr>
+      <w:bookmarkStart w:id="51" w:name="_Toc228748493"/>
+      <w:r>
+        <w:br w:type="page"/>
       </w:r>
     </w:p>
     <w:p>
@@ -16331,8 +16486,8 @@
           <w:numId w:val="7"/>
         </w:numPr>
       </w:pPr>
-      <w:bookmarkStart w:id="51" w:name="_Toc228748493"/>
-      <w:r>
+      <w:r>
+        <w:lastRenderedPageBreak/>
         <w:t>Comparative Evaluation of All Techniques</w:t>
       </w:r>
       <w:bookmarkEnd w:id="51"/>
@@ -18837,7 +18992,6 @@
                 <w:sz w:val="20"/>
                 <w:szCs w:val="20"/>
               </w:rPr>
-              <w:lastRenderedPageBreak/>
               <w:t>A* Search</w:t>
             </w:r>
           </w:p>
@@ -19605,18 +19759,21 @@
     <w:p>
       <w:pPr>
         <w:spacing w:before="240" w:after="120" w:line="360" w:lineRule="auto"/>
+        <w:ind w:firstLine="360"/>
         <w:jc w:val="both"/>
       </w:pPr>
       <w:r>
         <w:rPr>
           <w:color w:val="000000"/>
         </w:rPr>
+        <w:lastRenderedPageBreak/>
         <w:t>Frame-Stewart Dynamic Programming is the unambiguous best algorithm for four-peg Tower of Hanoi. It achieves the minimum known move count (conjectured optimal, verified for n ≤ 30), requires only O(n²) pre-computation, generates the move sequence in O(T(n,4)) time, and uses just O(n) space. No competing algorithm offers a better combination of these four properties.</w:t>
       </w:r>
     </w:p>
     <w:p>
       <w:pPr>
         <w:spacing w:before="240" w:after="120" w:line="360" w:lineRule="auto"/>
+        <w:ind w:firstLine="360"/>
         <w:jc w:val="both"/>
       </w:pPr>
       <w:r>
@@ -19635,13 +19792,30 @@
     <w:p>
       <w:pPr>
         <w:spacing w:before="240" w:after="120" w:line="360" w:lineRule="auto"/>
+        <w:ind w:firstLine="360"/>
         <w:jc w:val="both"/>
-      </w:pPr>
-      <w:r>
         <w:rPr>
           <w:color w:val="000000"/>
         </w:rPr>
+      </w:pPr>
+      <w:r>
+        <w:rPr>
+          <w:color w:val="000000"/>
+        </w:rPr>
         <w:t>The recommendation is clear and unanimous: use Frame-Stewart DP for any implementation of four-peg Tower of Hanoi. Consider IDA* with pattern databases only if Frame-Stewart optimality is theoretically questioned; consider BFS only for tiny n where exhaustive verification is the goal.</w:t>
+      </w:r>
+    </w:p>
+    <w:p>
+      <w:pPr>
+        <w:rPr>
+          <w:color w:val="000000"/>
+        </w:rPr>
+      </w:pPr>
+      <w:r>
+        <w:rPr>
+          <w:color w:val="000000"/>
+        </w:rPr>
+        <w:br w:type="page"/>
       </w:r>
     </w:p>
     <w:p>
@@ -19654,6 +19828,7 @@
       </w:pPr>
       <w:bookmarkStart w:id="55" w:name="_Toc228748498"/>
       <w:r>
+        <w:lastRenderedPageBreak/>
         <w:t>Key Findings and Insights</w:t>
       </w:r>
       <w:bookmarkEnd w:id="55"/>
@@ -19720,7 +19895,6 @@
         <w:rPr>
           <w:color w:val="000000"/>
         </w:rPr>
-        <w:lastRenderedPageBreak/>
         <w:t>Linear Space Throughout: Despite exponential move counts for large n, the algorithm requires O(n) space. This is the theoretical minimum for a path-tracing algorithm.</w:t>
       </w:r>
     </w:p>
@@ -19800,8 +19974,8 @@
       </w:r>
     </w:p>
     <w:sectPr>
-      <w:headerReference w:type="default" r:id="rId9"/>
-      <w:footerReference w:type="default" r:id="rId10"/>
+      <w:headerReference w:type="default" r:id="rId10"/>
+      <w:footerReference w:type="default" r:id="rId11"/>
       <w:pgSz w:w="12240" w:h="15840"/>
       <w:pgMar w:top="1440" w:right="1440" w:bottom="1440" w:left="1440" w:header="708" w:footer="708" w:gutter="0"/>
       <w:pgNumType w:start="1"/>
@@ -23082,6 +23256,25 @@
     <w:uiPriority w:val="99"/>
     <w:rsid w:val="00A770D7"/>
   </w:style>
+  <w:style w:type="paragraph" w:styleId="Caption">
+    <w:name w:val="caption"/>
+    <w:basedOn w:val="Normal"/>
+    <w:next w:val="Normal"/>
+    <w:uiPriority w:val="35"/>
+    <w:unhideWhenUsed/>
+    <w:qFormat/>
+    <w:rsid w:val="00DD4280"/>
+    <w:pPr>
+      <w:spacing w:after="200"/>
+    </w:pPr>
+    <w:rPr>
+      <w:i/>
+      <w:iCs/>
+      <w:color w:val="0E2841" w:themeColor="text2"/>
+      <w:sz w:val="18"/>
+      <w:szCs w:val="18"/>
+    </w:rPr>
+  </w:style>
 </w:styles>
 </file>
 
@@ -23398,4 +23591,16 @@
     </a:ext>
   </a:extLst>
 </a:theme>
+</file>
+
+<file path=customXml/item1.xml><?xml version="1.0" encoding="utf-8"?>
+<b:Sources xmlns:b="http://schemas.openxmlformats.org/officeDocument/2006/bibliography" xmlns="http://schemas.openxmlformats.org/officeDocument/2006/bibliography" SelectedStyle="\APASixthEditionOfficeOnline.xsl" StyleName="APA" Version="6"/>
+</file>
+
+<file path=customXml/itemProps1.xml><?xml version="1.0" encoding="utf-8"?>
+<ds:datastoreItem xmlns:ds="http://schemas.openxmlformats.org/officeDocument/2006/customXml" ds:itemID="{FBE94559-13E2-441F-9440-E96E6FD9B06A}">
+  <ds:schemaRefs>
+    <ds:schemaRef ds:uri="http://schemas.openxmlformats.org/officeDocument/2006/bibliography"/>
+  </ds:schemaRefs>
+</ds:datastoreItem>
 </file>
</xml_diff>